<commit_message>
actually added MCU selection documentation
</commit_message>
<xml_diff>
--- a/BOM/MCU SELECTION.docx
+++ b/BOM/MCU SELECTION.docx
@@ -86,10 +86,10 @@
         <w:t xml:space="preserve">Has proprietary antenna. No RF pin. </w:t>
       </w:r>
       <w:r>
-        <w:t>S</w:t>
-      </w:r>
-      <w:r>
-        <w:t>o it is hard to develop hardware around that as well as is probably does not have good RF capabilities</w:t>
+        <w:t>So,</w:t>
+      </w:r>
+      <w:r>
+        <w:t xml:space="preserve"> it is hard to develop hardware around that as well as is probably does not have good RF capabilities</w:t>
       </w:r>
       <w:r>
         <w:t xml:space="preserve"> relative to boards that have dedicated pins for RF.</w:t>

</xml_diff>